<commit_message>
Consolidated report: English version, continuous sections and appendices, ESG wording fixes, scenario and margin figures from the v2 DCF
Co-Authored-By: Claude Opus 5.5 <noreply@anthropic.com>
Claude-Session: https://claude.ai/code/session_0188QZHBkA8n5QL7BtmFakQg
</commit_message>
<xml_diff>
--- a/secciones/esg/documento/Mallplaza_ESG_EN.docx
+++ b/secciones/esg/documento/Mallplaza_ESG_EN.docx
@@ -21,22 +21,6 @@
         <w:t xml:space="preserve">ENVIRONMENTAL, SOCIAL AND GOVERNANCE (ESG)</w:t>
       </w:r>
     </w:p>
-    <w:p>
-      <w:pPr>
-        <w:shd w:fill="EEF1F6" w:color="auto" w:val="clear"/>
-        <w:spacing w:after="80" w:line="228" w:lineRule="auto"/>
-        <w:jc w:val="both"/>
-      </w:pPr>
-      <w:r>
-        <w:rPr>
-          <w:rFonts w:ascii="Arial" w:cs="Arial" w:eastAsia="Arial" w:hAnsi="Arial"/>
-          <w:color w:val="1A1A1A"/>
-          <w:sz w:val="16"/>
-          <w:szCs w:val="16"/>
-        </w:rPr>
-        <w:t xml:space="preserve">Plaza's ESG approach cuts across all of its decisions: it seeks to grow its business model within ESG parameters and contribute to sustainable development, which also opens up external financial benefits and savings in its own operations. Bloomberg rates the company at 3.39 points (Figure E1), below the global industry average (5–6 points) and its direct competitors in Chile; this contrasts with its local “green” profile, where it ranks among the region's leading real estate management (REM) companies.</w:t>
-      </w:r>
-    </w:p>
     <w:tbl>
       <w:tblPr>
         <w:tblW w:type="dxa" w:w="10666"/>
@@ -55,9 +39,6 @@
         <w:gridCol w:w="3550"/>
       </w:tblGrid>
       <w:tr>
-        <w:trPr>
-          <w:cantSplit/>
-        </w:trPr>
         <w:tc>
           <w:tcPr>
             <w:tcW w:type="dxa" w:w="6900"/>
@@ -83,8 +64,21 @@
             <w:r>
               <w:rPr>
                 <w:rFonts w:ascii="Arial" w:cs="Arial" w:eastAsia="Arial" w:hAnsi="Arial"/>
-                <w:b/>
-                <w:bCs/>
+                <w:i w:val="false"/>
+                <w:iCs w:val="false"/>
+                <w:color w:val="1A1A1A"/>
+                <w:sz w:val="16"/>
+                <w:szCs w:val="16"/>
+              </w:rPr>
+              <w:t xml:space="preserve">Plaza's ESG approach cuts across all of its organizational decisions, with the aim of developing its business model in accordance with ESG parameters and thereby contributing to sustainable development, which gives it the opportunity to access financial benefits both from external sources and from its own operations. Regarding compliance with these parameters, Bloomberg rates the company at 3.39 points, below the global industry average (5–6 points) and below its direct competitors in Chile (Figure E1); however, this is offset by the company's “green” profile at the local level, as it ranks among the leading real estate companies in the region. </w:t>
+            </w:r>
+            <w:r>
+              <w:rPr>
+                <w:rFonts w:ascii="Arial" w:cs="Arial" w:eastAsia="Arial" w:hAnsi="Arial"/>
+                <w:b/>
+                <w:bCs/>
+                <w:i w:val="false"/>
+                <w:iCs w:val="false"/>
                 <w:color w:val="14284B"/>
                 <w:sz w:val="16"/>
                 <w:szCs w:val="16"/>
@@ -94,11 +88,13 @@
             <w:r>
               <w:rPr>
                 <w:rFonts w:ascii="Arial" w:cs="Arial" w:eastAsia="Arial" w:hAnsi="Arial"/>
+                <w:i w:val="false"/>
+                <w:iCs w:val="false"/>
                 <w:color w:val="1A1A1A"/>
                 <w:sz w:val="16"/>
                 <w:szCs w:val="16"/>
               </w:rPr>
-              <w:t xml:space="preserve"> its ISO 50001-certified energy management system improves energy performance and lowers operating costs. External benefits depend on its ESG standing: in Chile, the R&amp;D Law (CORFO) allows 35% of R&amp;D spending to be credited against first-category income tax (up to 52.55% in total including the expense deduction); in Peru, the “Huella Perú” recognition (2 of 4 stars) eases permits and licences; and in Colombia, Law 2099 of 2021 allows investments in environmental control, conservation and improvement to be deducted from income tax.</w:t>
+              <w:t xml:space="preserve"> As for operational benefits, the implementation of an ISO 50001-certified energy management system (EnMS) translates into better energy performance and, consequently, lower operating costs. The opportunities to access local external benefits are tied to the company's ESG image: in Chile, under the R&amp;D Law (CORFO), Plaza can obtain up to a 55% reduction in first-category corporate income tax; Peru recognizes the company with 2 out of 4 stars under “Huella de Carbono Perú”, which strengthens the company's image and makes it easier to obtain permits and licenses in the country; and Colombia has Law 2099 of 2021, which allows income tax deductions for investments in environmental control, conservation and improvement.</w:t>
             </w:r>
           </w:p>
           <w:p>
@@ -106,7 +102,7 @@
               <w:pBdr>
                 <w:bottom w:val="single" w:color="E9004B" w:sz="8" w:space="1"/>
               </w:pBdr>
-              <w:spacing w:after="50" w:before="110"/>
+              <w:spacing w:after="50" w:before="90"/>
             </w:pPr>
             <w:r>
               <w:rPr>
@@ -128,23 +124,21 @@
             <w:r>
               <w:rPr>
                 <w:rFonts w:ascii="Arial" w:cs="Arial" w:eastAsia="Arial" w:hAnsi="Arial"/>
+                <w:i w:val="false"/>
+                <w:iCs w:val="false"/>
                 <w:color w:val="1A1A1A"/>
                 <w:sz w:val="16"/>
                 <w:szCs w:val="16"/>
               </w:rPr>
-              <w:t xml:space="preserve">Plaza aims for efficient, sustainable and circular operations, with three strategic focus areas: energy and water efficiency, carbon footprint and waste management. Its main goal is carbon neutrality, with a target of Net Zero direct and indirect emissions by 2035 (65.6% progress in 2025).</w:t>
-            </w:r>
-          </w:p>
-          <w:p>
-            <w:pPr>
-              <w:spacing w:after="60" w:before="0" w:line="228" w:lineRule="auto"/>
-              <w:jc w:val="both"/>
-            </w:pPr>
-            <w:r>
-              <w:rPr>
-                <w:rFonts w:ascii="Arial" w:cs="Arial" w:eastAsia="Arial" w:hAnsi="Arial"/>
-                <w:b/>
-                <w:bCs/>
+              <w:t xml:space="preserve">Plaza's approach is to achieve efficient, sustainable and circular operational management based on continuous improvement in environmental performance. To this end, it has set three strategic focus areas on ESG parameters: energy and water efficiency, carbon footprint, and waste management. Plaza's main objective is to achieve carbon neutrality, targeting Net Zero in direct and indirect emissions by 2035 (65.6% progress in 2025). </w:t>
+            </w:r>
+            <w:r>
+              <w:rPr>
+                <w:rFonts w:ascii="Arial" w:cs="Arial" w:eastAsia="Arial" w:hAnsi="Arial"/>
+                <w:b/>
+                <w:bCs/>
+                <w:i w:val="false"/>
+                <w:iCs w:val="false"/>
                 <w:color w:val="14284B"/>
                 <w:sz w:val="16"/>
                 <w:szCs w:val="16"/>
@@ -154,23 +148,21 @@
             <w:r>
               <w:rPr>
                 <w:rFonts w:ascii="Arial" w:cs="Arial" w:eastAsia="Arial" w:hAnsi="Arial"/>
+                <w:i w:val="false"/>
+                <w:iCs w:val="false"/>
                 <w:color w:val="1A1A1A"/>
                 <w:sz w:val="16"/>
                 <w:szCs w:val="16"/>
               </w:rPr>
-              <w:t xml:space="preserve"> the company is included in the DJSI Chile and DJSI MILA, and is the only South American real estate management (REM) company in the MSCI ESG indices, rated “BBB”, which gives it ETF exposure. It is also part of the S&amp;P Global Sustainability Yearbook, and Morningstar Sustainalytics assigns it an ESG risk score of 14.4 (low) (Figure E1).</w:t>
-            </w:r>
-          </w:p>
-          <w:p>
-            <w:pPr>
-              <w:spacing w:after="60" w:before="0" w:line="228" w:lineRule="auto"/>
-              <w:jc w:val="both"/>
-            </w:pPr>
-            <w:r>
-              <w:rPr>
-                <w:rFonts w:ascii="Arial" w:cs="Arial" w:eastAsia="Arial" w:hAnsi="Arial"/>
-                <w:b/>
-                <w:bCs/>
+              <w:t xml:space="preserve"> The company is included in the DJSI Chile and DJSI MILA, and is the only real estate company in South America to be part of MSCI ESG, with a “BBB” rating, which gives it exposure to ETFs. In addition, it has received the following recognitions: S&amp;P Global Sustainability Yearbook; Morningstar Sustainalytics assigns it a risk rating of 14.4; and Huella de Carbono Perú (2/4 stars), which supports its ESG image. </w:t>
+            </w:r>
+            <w:r>
+              <w:rPr>
+                <w:rFonts w:ascii="Arial" w:cs="Arial" w:eastAsia="Arial" w:hAnsi="Arial"/>
+                <w:b/>
+                <w:bCs/>
+                <w:i w:val="false"/>
+                <w:iCs w:val="false"/>
                 <w:color w:val="14284B"/>
                 <w:sz w:val="16"/>
                 <w:szCs w:val="16"/>
@@ -180,23 +172,21 @@
             <w:r>
               <w:rPr>
                 <w:rFonts w:ascii="Arial" w:cs="Arial" w:eastAsia="Arial" w:hAnsi="Arial"/>
+                <w:i w:val="false"/>
+                <w:iCs w:val="false"/>
                 <w:color w:val="1A1A1A"/>
                 <w:sz w:val="16"/>
                 <w:szCs w:val="16"/>
               </w:rPr>
-              <w:t xml:space="preserve"> the targets are a 22% cut in common-area energy intensity by 2035 (35.5% progress) and 100% renewable electricity by 2026 (89.3% progress) (Figure E2). In 2025 renewables supplied 90.9% of total consumption of 373,860 MWh (Figure E3), an intensity of 0.16 MWh/m² of GLA (0.14 renewable and 0.014 non-renewable).</w:t>
-            </w:r>
-          </w:p>
-          <w:p>
-            <w:pPr>
-              <w:spacing w:after="60" w:before="0" w:line="228" w:lineRule="auto"/>
-              <w:jc w:val="both"/>
-            </w:pPr>
-            <w:r>
-              <w:rPr>
-                <w:rFonts w:ascii="Arial" w:cs="Arial" w:eastAsia="Arial" w:hAnsi="Arial"/>
-                <w:b/>
-                <w:bCs/>
+              <w:t xml:space="preserve"> Plaza aims to reduce the energy intensity of common-area expenses by 22% by 2035 (35.5% progress in 2025; Figure E2). The electricity efficiency target is for 100% to come from renewable energy by 2026 (89.3% progress). In 2025, the annual ratio was 0.16 MWh/m² (Energy/GLA), of which 0.14 was renewable and 0.014 non-renewable (Figure E3).</w:t>
+            </w:r>
+            <w:r>
+              <w:rPr>
+                <w:rFonts w:ascii="Arial" w:cs="Arial" w:eastAsia="Arial" w:hAnsi="Arial"/>
+                <w:b/>
+                <w:bCs/>
+                <w:i w:val="false"/>
+                <w:iCs w:val="false"/>
                 <w:color w:val="14284B"/>
                 <w:sz w:val="16"/>
                 <w:szCs w:val="16"/>
@@ -206,23 +196,21 @@
             <w:r>
               <w:rPr>
                 <w:rFonts w:ascii="Arial" w:cs="Arial" w:eastAsia="Arial" w:hAnsi="Arial"/>
+                <w:i w:val="false"/>
+                <w:iCs w:val="false"/>
                 <w:color w:val="1A1A1A"/>
                 <w:sz w:val="16"/>
                 <w:szCs w:val="16"/>
               </w:rPr>
-              <w:t xml:space="preserve"> the target of a 30% cut in direct water consumption by 2025 was met at 100.9%, supported by LEED and EDGE certifications. In 2025 intensity was 0.77 m³/m² of GLA.</w:t>
-            </w:r>
-          </w:p>
-          <w:p>
-            <w:pPr>
-              <w:spacing w:after="60" w:before="0" w:line="228" w:lineRule="auto"/>
-              <w:jc w:val="both"/>
-            </w:pPr>
-            <w:r>
-              <w:rPr>
-                <w:rFonts w:ascii="Arial" w:cs="Arial" w:eastAsia="Arial" w:hAnsi="Arial"/>
-                <w:b/>
-                <w:bCs/>
+              <w:t xml:space="preserve"> It set the goal of reducing direct water consumption by 30% by 2025, which was 100.9% achieved, influenced by its LEED and EDGE certifications. In 2025, the annual ratio was 0.77 m³/m² (Water/GLA) and 0.66 m³/m² monthly in December. </w:t>
+            </w:r>
+            <w:r>
+              <w:rPr>
+                <w:rFonts w:ascii="Arial" w:cs="Arial" w:eastAsia="Arial" w:hAnsi="Arial"/>
+                <w:b/>
+                <w:bCs/>
+                <w:i w:val="false"/>
+                <w:iCs w:val="false"/>
                 <w:color w:val="14284B"/>
                 <w:sz w:val="16"/>
                 <w:szCs w:val="16"/>
@@ -232,23 +220,21 @@
             <w:r>
               <w:rPr>
                 <w:rFonts w:ascii="Arial" w:cs="Arial" w:eastAsia="Arial" w:hAnsi="Arial"/>
+                <w:i w:val="false"/>
+                <w:iCs w:val="false"/>
                 <w:color w:val="1A1A1A"/>
                 <w:sz w:val="16"/>
                 <w:szCs w:val="16"/>
               </w:rPr>
-              <w:t xml:space="preserve"> it plans to phase out 100% of HCFC use by 2030 (14.9% progress), key to managing greenhouse gas emissions, an area where Bloomberg recognises Plaza as a global industry leader.</w:t>
-            </w:r>
-          </w:p>
-          <w:p>
-            <w:pPr>
-              <w:spacing w:after="60" w:before="0" w:line="228" w:lineRule="auto"/>
-              <w:jc w:val="both"/>
-            </w:pPr>
-            <w:r>
-              <w:rPr>
-                <w:rFonts w:ascii="Arial" w:cs="Arial" w:eastAsia="Arial" w:hAnsi="Arial"/>
-                <w:b/>
-                <w:bCs/>
+              <w:t xml:space="preserve"> It set the goal of eliminating 100% of HCFC use by 2030 (14.9% progress in 2025), which is vital for GHG emissions management, an area in which Bloomberg recognizes Plaza as a global industry Leader. </w:t>
+            </w:r>
+            <w:r>
+              <w:rPr>
+                <w:rFonts w:ascii="Arial" w:cs="Arial" w:eastAsia="Arial" w:hAnsi="Arial"/>
+                <w:b/>
+                <w:bCs/>
+                <w:i w:val="false"/>
+                <w:iCs w:val="false"/>
                 <w:color w:val="14284B"/>
                 <w:sz w:val="16"/>
                 <w:szCs w:val="16"/>
@@ -258,23 +244,21 @@
             <w:r>
               <w:rPr>
                 <w:rFonts w:ascii="Arial" w:cs="Arial" w:eastAsia="Arial" w:hAnsi="Arial"/>
+                <w:i w:val="false"/>
+                <w:iCs w:val="false"/>
                 <w:color w:val="1A1A1A"/>
                 <w:sz w:val="16"/>
                 <w:szCs w:val="16"/>
               </w:rPr>
-              <w:t xml:space="preserve"> the target of recovering 60% of waste by 2025 shows 94.8% progress; it also aims to divert 75% of solid waste from landfill by 2027 and has already eliminated 97% of single-use plastics from its operations. In 2025 it recovered 46.2% of its non-hazardous waste (Figure E3).</w:t>
-            </w:r>
-          </w:p>
-          <w:p>
-            <w:pPr>
-              <w:spacing w:after="60" w:before="0" w:line="228" w:lineRule="auto"/>
-              <w:jc w:val="both"/>
-            </w:pPr>
-            <w:r>
-              <w:rPr>
-                <w:rFonts w:ascii="Arial" w:cs="Arial" w:eastAsia="Arial" w:hAnsi="Arial"/>
-                <w:b/>
-                <w:bCs/>
+              <w:t xml:space="preserve"> Plaza set a target of 60% recovery of waste generated in 2025 (94.8% progress; Figure E3 and Appendix [Y], Figure S4), and also seeks to divert 75% of solid waste from landfills by 2027. It reports having eliminated 97% of single-use plastics from its operations. </w:t>
+            </w:r>
+            <w:r>
+              <w:rPr>
+                <w:rFonts w:ascii="Arial" w:cs="Arial" w:eastAsia="Arial" w:hAnsi="Arial"/>
+                <w:b/>
+                <w:bCs/>
+                <w:i w:val="false"/>
+                <w:iCs w:val="false"/>
                 <w:color w:val="14284B"/>
                 <w:sz w:val="16"/>
                 <w:szCs w:val="16"/>
@@ -284,11 +268,13 @@
             <w:r>
               <w:rPr>
                 <w:rFonts w:ascii="Arial" w:cs="Arial" w:eastAsia="Arial" w:hAnsi="Arial"/>
+                <w:i w:val="false"/>
+                <w:iCs w:val="false"/>
                 <w:color w:val="1A1A1A"/>
                 <w:sz w:val="16"/>
                 <w:szCs w:val="16"/>
               </w:rPr>
-              <w:t xml:space="preserve"> Plaza follows the TCFD recommendations to integrate physical and transition risks, performs environmental due diligence on asset acquisitions and runs an environmental compliance programme aligned with ISO 14001, overseen by the sustainability committee.</w:t>
+              <w:t xml:space="preserve"> Plaza adopts the TCFD recommendations to integrate physical and transition risks, together with environmental due diligence on asset acquisitions, under an environmental compliance program aligned with ISO 14001 and monitored by the sustainability committee.</w:t>
             </w:r>
           </w:p>
           <w:p>
@@ -296,7 +282,7 @@
               <w:pBdr>
                 <w:bottom w:val="single" w:color="E9004B" w:sz="8" w:space="1"/>
               </w:pBdr>
-              <w:spacing w:after="50" w:before="110"/>
+              <w:spacing w:after="50" w:before="90"/>
             </w:pPr>
             <w:r>
               <w:rPr>
@@ -318,11 +304,13 @@
             <w:r>
               <w:rPr>
                 <w:rFonts w:ascii="Arial" w:cs="Arial" w:eastAsia="Arial" w:hAnsi="Arial"/>
+                <w:i w:val="false"/>
+                <w:iCs w:val="false"/>
                 <w:color w:val="1A1A1A"/>
                 <w:sz w:val="16"/>
                 <w:szCs w:val="16"/>
               </w:rPr>
-              <w:t xml:space="preserve">The company approaches social matters through a model of long-term ethical relationships based on shared value creation, placing its stakeholders at the centre of its strategy, in line with ISO 45001 and ILO guidelines. In 2025 it added a programme to detect and respond to risks under its human rights policy. It engages stakeholders through community dialogues and materiality assessments (Appendix [Y]) and handles any social incident through its integrity channel. Cadem ranked it 31st of 365 “Citizen Brands” and winner of the Shopping Centres category (2026). In 2025 its programmes and projects positively reached 49,325 people (Figure E4).</w:t>
+              <w:t xml:space="preserve">The company approaches the social dimension through a model focused on long-term ethical relationships, as a principle of shared value creation that places the people in its stakeholder groups at the center of its strategy, aligned with ISO 45001 and ILO guidelines; in 2025 it incorporated the risk detection and response program of its human rights policy. In this way, Plaza manages its stakeholders by ensuring transparent engagement, using mechanisms such as community dialogues and materiality assessments (Appendix [Y], Figure S3), and remains alert to any social incident through its integrity hotline. It is also ranked 31st out of 385 by CADEM in “Marcas Ciudadanas” (“Citizen Brands”), winning the “Shopping Centers” category (2026). Regarding employees, they receive training and even have access to specific programs for those nearing retirement (Appendix [Y], section 5); in addition, the company evaluates its suppliers using sustainability criteria (55.3% of regional suppliers and 38.4% of foreign suppliers). Plaza manages its relationship with its customers (tenants) through a relationship model focused on value proposition and experience, measuring their satisfaction through NPS, which rose to 13% in 2025 (Figure E4). To manage emergencies, each center has emergency manuals adapted to local geographic contexts and conducts drills to prevent incidents and educate the community (52 drills were conducted in 2025); regarding privacy, Plaza implemented ISO/IEC 27001, ensuring the confidentiality, integrity and availability of information against cyber risks.</w:t>
             </w:r>
           </w:p>
           <w:p>
@@ -333,100 +321,13 @@
             <w:r>
               <w:rPr>
                 <w:rFonts w:ascii="Arial" w:cs="Arial" w:eastAsia="Arial" w:hAnsi="Arial"/>
-                <w:b/>
-                <w:bCs/>
-                <w:color w:val="14284B"/>
-                <w:sz w:val="16"/>
-                <w:szCs w:val="16"/>
-              </w:rPr>
-              <w:t xml:space="preserve">Employees and suppliers:</w:t>
-            </w:r>
-            <w:r>
-              <w:rPr>
-                <w:rFonts w:ascii="Arial" w:cs="Arial" w:eastAsia="Arial" w:hAnsi="Arial"/>
+                <w:i w:val="false"/>
+                <w:iCs w:val="false"/>
                 <w:color w:val="1A1A1A"/>
                 <w:sz w:val="16"/>
                 <w:szCs w:val="16"/>
               </w:rPr>
-              <w:t xml:space="preserve"> it trains its staff, offers programmes for employees nearing retirement and assesses suppliers on sustainability criteria (55.3% of local suppliers and 38.4% of foreign ones).</w:t>
-            </w:r>
-          </w:p>
-          <w:p>
-            <w:pPr>
-              <w:spacing w:after="60" w:before="0" w:line="228" w:lineRule="auto"/>
-              <w:jc w:val="both"/>
-            </w:pPr>
-            <w:r>
-              <w:rPr>
-                <w:rFonts w:ascii="Arial" w:cs="Arial" w:eastAsia="Arial" w:hAnsi="Arial"/>
-                <w:b/>
-                <w:bCs/>
-                <w:color w:val="14284B"/>
-                <w:sz w:val="16"/>
-                <w:szCs w:val="16"/>
-              </w:rPr>
-              <w:t xml:space="preserve">Tenants:</w:t>
-            </w:r>
-            <w:r>
-              <w:rPr>
-                <w:rFonts w:ascii="Arial" w:cs="Arial" w:eastAsia="Arial" w:hAnsi="Arial"/>
-                <w:color w:val="1A1A1A"/>
-                <w:sz w:val="16"/>
-                <w:szCs w:val="16"/>
-              </w:rPr>
-              <w:t xml:space="preserve"> it manages tenant relationships through an engagement model focused on value proposition and experience; tenant NPS rose from −8% in 2022 to 13% in 2025 (Figure E4).</w:t>
-            </w:r>
-          </w:p>
-          <w:p>
-            <w:pPr>
-              <w:spacing w:after="60" w:before="0" w:line="228" w:lineRule="auto"/>
-              <w:jc w:val="both"/>
-            </w:pPr>
-            <w:r>
-              <w:rPr>
-                <w:rFonts w:ascii="Arial" w:cs="Arial" w:eastAsia="Arial" w:hAnsi="Arial"/>
-                <w:b/>
-                <w:bCs/>
-                <w:color w:val="14284B"/>
-                <w:sz w:val="16"/>
-                <w:szCs w:val="16"/>
-              </w:rPr>
-              <w:t xml:space="preserve">Safety and privacy:</w:t>
-            </w:r>
-            <w:r>
-              <w:rPr>
-                <w:rFonts w:ascii="Arial" w:cs="Arial" w:eastAsia="Arial" w:hAnsi="Arial"/>
-                <w:color w:val="1A1A1A"/>
-                <w:sz w:val="16"/>
-                <w:szCs w:val="16"/>
-              </w:rPr>
-              <w:t xml:space="preserve"> every centre has emergency manuals adapted to its local context, and 52 community drills were held in 2025. It implemented ISO/IEC 27001 to protect the confidentiality, integrity and availability of information against cyber risks.</w:t>
-            </w:r>
-          </w:p>
-          <w:p>
-            <w:pPr>
-              <w:spacing w:after="60" w:before="0" w:line="228" w:lineRule="auto"/>
-              <w:jc w:val="both"/>
-            </w:pPr>
-            <w:r>
-              <w:rPr>
-                <w:rFonts w:ascii="Arial" w:cs="Arial" w:eastAsia="Arial" w:hAnsi="Arial"/>
-                <w:b/>
-                <w:bCs/>
-                <w:color w:val="14284B"/>
-                <w:sz w:val="16"/>
-                <w:szCs w:val="16"/>
-              </w:rPr>
-              <w:t xml:space="preserve">Diversity:</w:t>
-            </w:r>
-            <w:r>
-              <w:rPr>
-                <w:rFonts w:ascii="Arial" w:cs="Arial" w:eastAsia="Arial" w:hAnsi="Arial"/>
-                <w:color w:val="1A1A1A"/>
-                <w:sz w:val="16"/>
-                <w:szCs w:val="16"/>
-              </w:rPr>
-              <w:t xml:space="preserve"> women make up 53% of the workforce (403 people) and 42% of management positions (44), with an average gender pay gap of 28% across the region. The 2028 target is for 60% of centres to be certified as inclusive spaces, and Plaza earned the “Sello Mayor” seal, which certifies its physical and operational adaptation for older people.</w:t>
+              <w:t xml:space="preserve">In terms of diversity, women represent 53.2% of the total workforce and hold 42% of management positions (Figure E4), and there is an average gender pay gap of 28% at the regional level. The target for 2028 is for 60% of the properties to be certified as inclusive spaces; in addition, Plaza obtained the “Sello Mayor” (“Senior Seal”), a distinction that certifies physical and operational adaptation for older adults.</w:t>
             </w:r>
           </w:p>
         </w:tc>
@@ -488,7 +389,7 @@
                 <w:sz w:val="14"/>
                 <w:szCs w:val="14"/>
               </w:rPr>
-              <w:t xml:space="preserve">Bloomberg ESG score and external ratings</w:t>
+              <w:t xml:space="preserve">Bloomberg ESG score and external ratings.</w:t>
             </w:r>
           </w:p>
           <w:p>
@@ -543,16 +444,18 @@
             <w:r>
               <w:rPr>
                 <w:rFonts w:ascii="Arial" w:cs="Arial" w:eastAsia="Arial" w:hAnsi="Arial"/>
+                <w:i w:val="false"/>
+                <w:iCs w:val="false"/>
                 <w:color w:val="5F5F5F"/>
                 <w:sz w:val="11"/>
                 <w:szCs w:val="11"/>
               </w:rPr>
-              <w:t xml:space="preserve">Source: Bloomberg (ESG score); MSCI, Morningstar Sustainalytics, S&amp;P Global, Huella Perú; Mallplaza Annual Report 2025.</w:t>
-            </w:r>
-          </w:p>
-          <w:p>
-            <w:pPr>
-              <w:spacing w:after="30" w:before="110" w:line="228" w:lineRule="auto"/>
+              <w:t xml:space="preserve">Source: Bloomberg (ESG score); MSCI, Morningstar Sustainalytics, S&amp;P Global, Huella Perú; Mallplaza 2025 Annual Report.</w:t>
+            </w:r>
+          </w:p>
+          <w:p>
+            <w:pPr>
+              <w:spacing w:after="30" w:before="90" w:line="228" w:lineRule="auto"/>
             </w:pPr>
             <w:r>
               <w:rPr>
@@ -572,7 +475,7 @@
                 <w:sz w:val="14"/>
                 <w:szCs w:val="14"/>
               </w:rPr>
-              <w:t xml:space="preserve">Environmental targets: progress to 2025</w:t>
+              <w:t xml:space="preserve">Environmental targets: progress to 2025.</w:t>
             </w:r>
           </w:p>
           <w:p>
@@ -627,16 +530,18 @@
             <w:r>
               <w:rPr>
                 <w:rFonts w:ascii="Arial" w:cs="Arial" w:eastAsia="Arial" w:hAnsi="Arial"/>
+                <w:i w:val="false"/>
+                <w:iCs w:val="false"/>
                 <w:color w:val="5F5F5F"/>
                 <w:sz w:val="11"/>
                 <w:szCs w:val="11"/>
               </w:rPr>
-              <w:t xml:space="preserve">Source: Mallplaza Annual Report 2025.</w:t>
-            </w:r>
-          </w:p>
-          <w:p>
-            <w:pPr>
-              <w:spacing w:after="30" w:before="110" w:line="228" w:lineRule="auto"/>
+              <w:t xml:space="preserve">Source: Mallplaza 2025 Annual Report.</w:t>
+            </w:r>
+          </w:p>
+          <w:p>
+            <w:pPr>
+              <w:spacing w:after="30" w:before="90" w:line="228" w:lineRule="auto"/>
             </w:pPr>
             <w:r>
               <w:rPr>
@@ -656,7 +561,7 @@
                 <w:sz w:val="14"/>
                 <w:szCs w:val="14"/>
               </w:rPr>
-              <w:t xml:space="preserve">Renewable energy and waste recovery, 2025</w:t>
+              <w:t xml:space="preserve">Renewable energy and waste recovery, 2025.</w:t>
             </w:r>
           </w:p>
           <w:p>
@@ -711,16 +616,18 @@
             <w:r>
               <w:rPr>
                 <w:rFonts w:ascii="Arial" w:cs="Arial" w:eastAsia="Arial" w:hAnsi="Arial"/>
+                <w:i w:val="false"/>
+                <w:iCs w:val="false"/>
                 <w:color w:val="5F5F5F"/>
                 <w:sz w:val="11"/>
                 <w:szCs w:val="11"/>
               </w:rPr>
-              <w:t xml:space="preserve">Recovery: share of non-hazardous waste; the breakdown adds up to 100% of recovered waste. Source: Mallplaza Annual Report 2025.</w:t>
-            </w:r>
-          </w:p>
-          <w:p>
-            <w:pPr>
-              <w:spacing w:after="30" w:before="110" w:line="228" w:lineRule="auto"/>
+              <w:t xml:space="preserve">Recovery: percentage of non-hazardous waste; the breakdown adds up to 100% of recovered waste. Source: Mallplaza 2025 Annual Report.</w:t>
+            </w:r>
+          </w:p>
+          <w:p>
+            <w:pPr>
+              <w:spacing w:after="30" w:before="90" w:line="228" w:lineRule="auto"/>
             </w:pPr>
             <w:r>
               <w:rPr>
@@ -740,7 +647,7 @@
                 <w:sz w:val="14"/>
                 <w:szCs w:val="14"/>
               </w:rPr>
-              <w:t xml:space="preserve">Social indicators</w:t>
+              <w:t xml:space="preserve">Social indicators.</w:t>
             </w:r>
           </w:p>
           <w:p>
@@ -795,22 +702,18 @@
             <w:r>
               <w:rPr>
                 <w:rFonts w:ascii="Arial" w:cs="Arial" w:eastAsia="Arial" w:hAnsi="Arial"/>
+                <w:i w:val="false"/>
+                <w:iCs w:val="false"/>
                 <w:color w:val="5F5F5F"/>
                 <w:sz w:val="11"/>
                 <w:szCs w:val="11"/>
               </w:rPr>
-              <w:t xml:space="preserve">NPS = % promoters (scores 9–10) minus % detractors (0–6). Source: Mallplaza Annual Report 2025.</w:t>
+              <w:t xml:space="preserve">NPS = % of promoters (scores 9–10) minus % of detractors (0–6). Source: Mallplaza 2025 Annual Report.</w:t>
             </w:r>
           </w:p>
         </w:tc>
       </w:tr>
     </w:tbl>
-    <w:p>
-      <w:pPr>
-        <w:pageBreakBefore/>
-        <w:spacing w:after="0"/>
-      </w:pPr>
-    </w:p>
     <w:tbl>
       <w:tblPr>
         <w:tblW w:type="dxa" w:w="10666"/>
@@ -829,9 +732,6 @@
         <w:gridCol w:w="3550"/>
       </w:tblGrid>
       <w:tr>
-        <w:trPr>
-          <w:cantSplit/>
-        </w:trPr>
         <w:tc>
           <w:tcPr>
             <w:tcW w:type="dxa" w:w="6900"/>
@@ -876,23 +776,21 @@
             <w:r>
               <w:rPr>
                 <w:rFonts w:ascii="Arial" w:cs="Arial" w:eastAsia="Arial" w:hAnsi="Arial"/>
+                <w:i w:val="false"/>
+                <w:iCs w:val="false"/>
                 <w:color w:val="1A1A1A"/>
                 <w:sz w:val="16"/>
                 <w:szCs w:val="16"/>
               </w:rPr>
-              <w:t xml:space="preserve">Corporate governance follows the G20/OECD principles and the CMF's General Rule 461, to ensure transparent management, risk control and a solid structure to monitor the strategy and ESG commitments.</w:t>
-            </w:r>
-          </w:p>
-          <w:p>
-            <w:pPr>
-              <w:spacing w:after="60" w:before="0" w:line="228" w:lineRule="auto"/>
-              <w:jc w:val="both"/>
-            </w:pPr>
-            <w:r>
-              <w:rPr>
-                <w:rFonts w:ascii="Arial" w:cs="Arial" w:eastAsia="Arial" w:hAnsi="Arial"/>
-                <w:b/>
-                <w:bCs/>
+              <w:t xml:space="preserve">Corporate governance is guided by the G20 and OECD principles, aligned with the CMF's NCG 461; all of this seeks transparent management with risk control and a solid structure to monitor the corporate strategy and ESG commitments. </w:t>
+            </w:r>
+            <w:r>
+              <w:rPr>
+                <w:rFonts w:ascii="Arial" w:cs="Arial" w:eastAsia="Arial" w:hAnsi="Arial"/>
+                <w:b/>
+                <w:bCs/>
+                <w:i w:val="false"/>
+                <w:iCs w:val="false"/>
                 <w:color w:val="14284B"/>
                 <w:sz w:val="16"/>
                 <w:szCs w:val="16"/>
@@ -902,63 +800,61 @@
             <w:r>
               <w:rPr>
                 <w:rFonts w:ascii="Arial" w:cs="Arial" w:eastAsia="Arial" w:hAnsi="Arial"/>
+                <w:i w:val="false"/>
+                <w:iCs w:val="false"/>
                 <w:color w:val="1A1A1A"/>
                 <w:sz w:val="16"/>
                 <w:szCs w:val="16"/>
               </w:rPr>
-              <w:t xml:space="preserve"> the 9-member Board sets Plaza's objectives, strategies and policies, but only one director is independent (Figure E5). The three-member directors' committee, chaired by the independent director, reviews related-party transactions (Law 18,046). Falabella controls 53.05% of the shares and pension funds hold 23.8% (Appendix [Y]). Low board independence is the main governance weakness (RR1, Investment Risks).</w:t>
-            </w:r>
-          </w:p>
-          <w:p>
-            <w:pPr>
-              <w:spacing w:after="60" w:before="0" w:line="228" w:lineRule="auto"/>
-              <w:jc w:val="both"/>
-            </w:pPr>
-            <w:r>
-              <w:rPr>
-                <w:rFonts w:ascii="Arial" w:cs="Arial" w:eastAsia="Arial" w:hAnsi="Arial"/>
-                <w:b/>
-                <w:bCs/>
-                <w:color w:val="14284B"/>
-                <w:sz w:val="16"/>
-                <w:szCs w:val="16"/>
-              </w:rPr>
-              <w:t xml:space="preserve">ESG incentives:</w:t>
-            </w:r>
-            <w:r>
-              <w:rPr>
-                <w:rFonts w:ascii="Arial" w:cs="Arial" w:eastAsia="Arial" w:hAnsi="Arial"/>
+              <w:t xml:space="preserve"> In 2025, the Board, composed of 9 members (only one of whom is classified as independent; Figure E5 and Appendix [Y], Figure S2), is responsible for defining Plaza's objectives, strategies and policies, while the directors' committee (composed of 3 members) reviews the balance sheets and financial statements, thereby mitigating agency risks. Together, both bodies oversee the risk management led by the executive team committee and the CEO. In the second half of 2025, CEO Fernando de Peña Iver submitted his resignation, effective at year-end, and Pablo Pulido Sierra took over the position in 2026. </w:t>
+            </w:r>
+            <w:r>
+              <w:rPr>
+                <w:rFonts w:ascii="Arial" w:cs="Arial" w:eastAsia="Arial" w:hAnsi="Arial"/>
+                <w:b/>
+                <w:bCs/>
+                <w:i w:val="false"/>
+                <w:iCs w:val="false"/>
+                <w:color w:val="14284B"/>
+                <w:sz w:val="16"/>
+                <w:szCs w:val="16"/>
+              </w:rPr>
+              <w:t xml:space="preserve">Shareholders:</w:t>
+            </w:r>
+            <w:r>
+              <w:rPr>
+                <w:rFonts w:ascii="Arial" w:cs="Arial" w:eastAsia="Arial" w:hAnsi="Arial"/>
+                <w:i w:val="false"/>
+                <w:iCs w:val="false"/>
                 <w:color w:val="1A1A1A"/>
                 <w:sz w:val="16"/>
                 <w:szCs w:val="16"/>
               </w:rPr>
-              <w:t xml:space="preserve"> ESG KPIs are measured annually and are part of the variable pay of the CEO, managers and deputy managers. Non-financial indicators weigh 61% (33.3% linked directly to ESG matters and 27.7% to other topics) and financial indicators 39% (Figure E5).</w:t>
-            </w:r>
-          </w:p>
-          <w:p>
-            <w:pPr>
-              <w:spacing w:after="60" w:before="0" w:line="228" w:lineRule="auto"/>
-              <w:jc w:val="both"/>
-            </w:pPr>
-            <w:r>
-              <w:rPr>
-                <w:rFonts w:ascii="Arial" w:cs="Arial" w:eastAsia="Arial" w:hAnsi="Arial"/>
-                <w:b/>
-                <w:bCs/>
-                <w:color w:val="14284B"/>
-                <w:sz w:val="16"/>
-                <w:szCs w:val="16"/>
-              </w:rPr>
-              <w:t xml:space="preserve">Ethics and compliance:</w:t>
-            </w:r>
-            <w:r>
-              <w:rPr>
-                <w:rFonts w:ascii="Arial" w:cs="Arial" w:eastAsia="Arial" w:hAnsi="Arial"/>
+              <w:t xml:space="preserve"> Plaza has a concentrated control model, as it is controlled by Falabella S.A. through its subsidiary Desarrollos Inmobiliarios SpA (53.05% of the shares; Appendix [Y], Figure S1). Minority shareholders holding 1% are entitled to propose director candidates, and the shareholders are the highest body, responsible for appointing the Board and external auditors and approving dividend policies. </w:t>
+            </w:r>
+            <w:r>
+              <w:rPr>
+                <w:rFonts w:ascii="Arial" w:cs="Arial" w:eastAsia="Arial" w:hAnsi="Arial"/>
+                <w:b/>
+                <w:bCs/>
+                <w:i w:val="false"/>
+                <w:iCs w:val="false"/>
+                <w:color w:val="14284B"/>
+                <w:sz w:val="16"/>
+                <w:szCs w:val="16"/>
+              </w:rPr>
+              <w:t xml:space="preserve">Ethics, audit and control:</w:t>
+            </w:r>
+            <w:r>
+              <w:rPr>
+                <w:rFonts w:ascii="Arial" w:cs="Arial" w:eastAsia="Arial" w:hAnsi="Arial"/>
+                <w:i w:val="false"/>
+                <w:iCs w:val="false"/>
                 <w:color w:val="1A1A1A"/>
                 <w:sz w:val="16"/>
                 <w:szCs w:val="16"/>
               </w:rPr>
-              <w:t xml:space="preserve"> in 2025 there were no breaches of laws and regulations and no corruption cases. There were 27 breaches of consumer rights (Law 19,496), 2 of labour rights, 1 proceeding by the Environment Superintendency and 8 complaints of workplace harassment or violence (Appendix [Y]).</w:t>
+              <w:t xml:space="preserve"> The ethical framework is supported by the integrity code and the crime prevention model, which together provide a guide for the organization's conduct. In addition, Plaza operates the Autocompliance platform to record meetings with public officials and manage gifts and invitations, along with a confidential integrity hotline for reporting irregularities without risk to the whistleblower. Under the supervision of the directors' committee, a control model is in place, with an internal audit reported monthly to the committee that monitors corrective actions; in parallel, the committee must appoint external auditors and credit rating agencies to analyze the company, as well as have the financial statements audited by independent auditors. Regarding sanctions at the regional level in 2025, Plaza has no antitrust or corruption sanctions, but it has 27 sanctions related to customer/consumer rights, 2 related to workers' rights, 1 from the Superintendency of the Environment and 8 for workplace/sexual harassment (Appendix [Y], section 3).</w:t>
             </w:r>
           </w:p>
         </w:tc>
@@ -1020,7 +916,7 @@
                 <w:sz w:val="14"/>
                 <w:szCs w:val="14"/>
               </w:rPr>
-              <w:t xml:space="preserve">ESG incentives and board composition</w:t>
+              <w:t xml:space="preserve">ESG incentives and Board composition.</w:t>
             </w:r>
           </w:p>
           <w:p>
@@ -1075,11 +971,13 @@
             <w:r>
               <w:rPr>
                 <w:rFonts w:ascii="Arial" w:cs="Arial" w:eastAsia="Arial" w:hAnsi="Arial"/>
+                <w:i w:val="false"/>
+                <w:iCs w:val="false"/>
                 <w:color w:val="5F5F5F"/>
                 <w:sz w:val="11"/>
                 <w:szCs w:val="11"/>
               </w:rPr>
-              <w:t xml:space="preserve">Source: Mallplaza Annual Report 2025.</w:t>
+              <w:t xml:space="preserve">Source: Mallplaza 2025 Annual Report.</w:t>
             </w:r>
           </w:p>
         </w:tc>

</xml_diff>